<commit_message>
Update 12 mar 2026
</commit_message>
<xml_diff>
--- a/uprojects/John Ottolenghi/Summery001.docx
+++ b/uprojects/John Ottolenghi/Summery001.docx
@@ -9,7 +9,15 @@
       </w:r>
     </w:p>
     <w:p>
+      <w:pPr>
+        <w:rPr>
+          <w:color w:val="EE0000"/>
+        </w:rPr>
+      </w:pPr>
       <w:r>
+        <w:rPr>
+          <w:color w:val="EE0000"/>
+        </w:rPr>
         <w:t>MQ Sensors requires a large amount of power. One LM2596 is not enough.</w:t>
       </w:r>
     </w:p>
@@ -19,7 +27,15 @@
       </w:r>
     </w:p>
     <w:p>
+      <w:pPr>
+        <w:rPr>
+          <w:color w:val="EE0000"/>
+        </w:rPr>
+      </w:pPr>
       <w:r>
+        <w:rPr>
+          <w:color w:val="EE0000"/>
+        </w:rPr>
         <w:t>Each resistor near each sensor is just Load resistor. Filter resistor and capacitors are placed under the Arduino Board near each ADC pin.</w:t>
       </w:r>
     </w:p>
@@ -28,7 +44,19 @@
         <w:t>3. Remove U11. Remember the cost of this is not $215 do I removed it from the design. We will keep the NO2 (u14) because we need that for finding explosives.</w:t>
       </w:r>
     </w:p>
-    <w:p/>
+    <w:p>
+      <w:pPr>
+        <w:rPr>
+          <w:color w:val="EE0000"/>
+        </w:rPr>
+      </w:pPr>
+      <w:r>
+        <w:rPr>
+          <w:color w:val="EE0000"/>
+        </w:rPr>
+        <w:t>Okay removed.</w:t>
+      </w:r>
+    </w:p>
     <w:p>
       <w:r>
         <w:t>4. I wish we had a rigid solution for the ZE08 - CH20. The ribbon connector is too flimsy. If I could find a shorter cable like 5cm that would work, but having found it yet.</w:t>
@@ -38,6 +66,132 @@
     <w:p>
       <w:r>
         <w:t>What is this?</w:t>
+      </w:r>
+    </w:p>
+    <w:p>
+      <w:r>
+        <w:rPr>
+          <w:noProof/>
+        </w:rPr>
+        <w:drawing>
+          <wp:inline distT="0" distB="0" distL="0" distR="0" wp14:anchorId="18A237BA" wp14:editId="332FA23C">
+            <wp:extent cx="2876550" cy="2466975"/>
+            <wp:effectExtent l="0" t="0" r="0" b="9525"/>
+            <wp:docPr id="2123693682" name="Picture 1"/>
+            <wp:cNvGraphicFramePr>
+              <a:graphicFrameLocks xmlns:a="http://schemas.openxmlformats.org/drawingml/2006/main" noChangeAspect="1"/>
+            </wp:cNvGraphicFramePr>
+            <a:graphic xmlns:a="http://schemas.openxmlformats.org/drawingml/2006/main">
+              <a:graphicData uri="http://schemas.openxmlformats.org/drawingml/2006/picture">
+                <pic:pic xmlns:pic="http://schemas.openxmlformats.org/drawingml/2006/picture">
+                  <pic:nvPicPr>
+                    <pic:cNvPr id="2123693682" name="Picture 2123693682"/>
+                    <pic:cNvPicPr/>
+                  </pic:nvPicPr>
+                  <pic:blipFill>
+                    <a:blip r:embed="rId4">
+                      <a:extLst>
+                        <a:ext uri="{28A0092B-C50C-407E-A947-70E740481C1C}">
+                          <a14:useLocalDpi xmlns:a14="http://schemas.microsoft.com/office/drawing/2010/main" val="0"/>
+                        </a:ext>
+                      </a:extLst>
+                    </a:blip>
+                    <a:stretch>
+                      <a:fillRect/>
+                    </a:stretch>
+                  </pic:blipFill>
+                  <pic:spPr>
+                    <a:xfrm>
+                      <a:off x="0" y="0"/>
+                      <a:ext cx="2876550" cy="2466975"/>
+                    </a:xfrm>
+                    <a:prstGeom prst="rect">
+                      <a:avLst/>
+                    </a:prstGeom>
+                  </pic:spPr>
+                </pic:pic>
+              </a:graphicData>
+            </a:graphic>
+          </wp:inline>
+        </w:drawing>
+      </w:r>
+    </w:p>
+    <w:p>
+      <w:pPr>
+        <w:rPr>
+          <w:color w:val="EE0000"/>
+        </w:rPr>
+      </w:pPr>
+      <w:r>
+        <w:rPr>
+          <w:color w:val="EE0000"/>
+        </w:rPr>
+        <w:t>This is ZP-07 Sensor Module</w:t>
+      </w:r>
+    </w:p>
+    <w:p/>
+    <w:p/>
+    <w:p/>
+    <w:p/>
+    <w:p>
+      <w:r>
+        <w:rPr>
+          <w:noProof/>
+        </w:rPr>
+        <w:drawing>
+          <wp:inline distT="0" distB="0" distL="0" distR="0" wp14:anchorId="704CC4DC" wp14:editId="04A5CB94">
+            <wp:extent cx="2752725" cy="1733550"/>
+            <wp:effectExtent l="0" t="0" r="9525" b="0"/>
+            <wp:docPr id="2110547858" name="Picture 2"/>
+            <wp:cNvGraphicFramePr>
+              <a:graphicFrameLocks xmlns:a="http://schemas.openxmlformats.org/drawingml/2006/main" noChangeAspect="1"/>
+            </wp:cNvGraphicFramePr>
+            <a:graphic xmlns:a="http://schemas.openxmlformats.org/drawingml/2006/main">
+              <a:graphicData uri="http://schemas.openxmlformats.org/drawingml/2006/picture">
+                <pic:pic xmlns:pic="http://schemas.openxmlformats.org/drawingml/2006/picture">
+                  <pic:nvPicPr>
+                    <pic:cNvPr id="2110547858" name="Picture 2110547858"/>
+                    <pic:cNvPicPr/>
+                  </pic:nvPicPr>
+                  <pic:blipFill>
+                    <a:blip r:embed="rId5">
+                      <a:extLst>
+                        <a:ext uri="{28A0092B-C50C-407E-A947-70E740481C1C}">
+                          <a14:useLocalDpi xmlns:a14="http://schemas.microsoft.com/office/drawing/2010/main" val="0"/>
+                        </a:ext>
+                      </a:extLst>
+                    </a:blip>
+                    <a:stretch>
+                      <a:fillRect/>
+                    </a:stretch>
+                  </pic:blipFill>
+                  <pic:spPr>
+                    <a:xfrm>
+                      <a:off x="0" y="0"/>
+                      <a:ext cx="2752725" cy="1733550"/>
+                    </a:xfrm>
+                    <a:prstGeom prst="rect">
+                      <a:avLst/>
+                    </a:prstGeom>
+                  </pic:spPr>
+                </pic:pic>
+              </a:graphicData>
+            </a:graphic>
+          </wp:inline>
+        </w:drawing>
+      </w:r>
+    </w:p>
+    <w:p>
+      <w:pPr>
+        <w:rPr>
+          <w:color w:val="EE0000"/>
+        </w:rPr>
+      </w:pPr>
+      <w:r>
+        <w:rPr>
+          <w:color w:val="EE0000"/>
+        </w:rPr>
+        <w:t>DC Power Jack</w:t>
       </w:r>
     </w:p>
     <w:p/>
@@ -654,6 +808,7 @@
   <w:style w:type="character" w:default="1" w:styleId="DefaultParagraphFont">
     <w:name w:val="Default Paragraph Font"/>
     <w:uiPriority w:val="1"/>
+    <w:semiHidden/>
     <w:unhideWhenUsed/>
   </w:style>
   <w:style w:type="table" w:default="1" w:styleId="TableNormal">

</xml_diff>